<commit_message>
Modification d'un asset (cours)
</commit_message>
<xml_diff>
--- a/Assets/td16_MVC_inscription.docx
+++ b/Assets/td16_MVC_inscription.docx
@@ -867,43 +867,6 @@
         <w:rPr>
           <w:b/>
           <w:bCs/>
-          <w:lang w:val="fr-FR"/>
-        </w:rPr>
-        <w:t xml:space="preserve">Ajouter la possibilité de supprimer ou modifier un commentaire déjà fait</w:t>
-      </w:r>
-      <w:r>
-        <w:rPr>
-          <w:b/>
-          <w:bCs/>
-          <w:highlight w:val="none"/>
-          <w:lang w:val="fr-FR"/>
-        </w:rPr>
-      </w:r>
-      <w:r>
-        <w:rPr>
-          <w:b/>
-          <w:bCs/>
-          <w:highlight w:val="none"/>
-          <w:lang w:val="fr-FR"/>
-        </w:rPr>
-      </w:r>
-    </w:p>
-    <w:p>
-      <w:pPr>
-        <w:pBdr/>
-        <w:spacing/>
-        <w:ind/>
-        <w:rPr>
-          <w:b/>
-          <w:bCs/>
-          <w:highlight w:val="none"/>
-          <w:lang w:val="fr-FR"/>
-        </w:rPr>
-      </w:pPr>
-      <w:r>
-        <w:rPr>
-          <w:b/>
-          <w:bCs/>
           <w:highlight w:val="none"/>
           <w:lang w:val="fr-FR" w:bidi="fr-FR"/>
         </w:rPr>
@@ -925,6 +888,7 @@
           <w:highlight w:val="none"/>
           <w:lang w:val="fr-FR"/>
         </w:rPr>
+        <w:t xml:space="preserve"> [FAIT]</w:t>
       </w:r>
       <w:r>
         <w:rPr>
@@ -960,8 +924,10 @@
         <w:rPr>
           <w:b/>
           <w:bCs/>
+          <w:highlight w:val="none"/>
           <w:lang w:val="fr-FR"/>
         </w:rPr>
+        <w:t xml:space="preserve"> [FAIT]</w:t>
       </w:r>
       <w:r>
         <w:rPr>
@@ -996,7 +962,6 @@
         <w:rPr>
           <w:b/>
           <w:bCs/>
-          <w:highlight w:val="none"/>
           <w:lang w:val="fr-FR"/>
         </w:rPr>
       </w:r>
@@ -1027,6 +992,45 @@
           <w:lang w:val="fr-FR"/>
         </w:rPr>
         <w:t xml:space="preserve">Faire la Page « Mon Profil » avec les informations de l’utilisateur ainsi que la possibilité de modifier les informations et le mot de passe de l’utilisateur.</w:t>
+      </w:r>
+      <w:r>
+        <w:rPr>
+          <w:b/>
+          <w:bCs/>
+          <w:highlight w:val="none"/>
+          <w:lang w:val="fr-FR"/>
+        </w:rPr>
+        <w:t xml:space="preserve"> [FAIT]</w:t>
+      </w:r>
+      <w:r>
+        <w:rPr>
+          <w:b/>
+          <w:bCs/>
+          <w:highlight w:val="none"/>
+          <w:lang w:val="fr-FR"/>
+        </w:rPr>
+      </w:r>
+    </w:p>
+    <w:p>
+      <w:pPr>
+        <w:pBdr/>
+        <w:spacing/>
+        <w:ind/>
+        <w:rPr>
+          <w:b/>
+          <w:bCs/>
+          <w:highlight w:val="none"/>
+          <w:lang w:val="fr-FR"/>
+        </w:rPr>
+      </w:pPr>
+      <w:r>
+        <w:rPr>
+          <w:b/>
+          <w:bCs/>
+          <w:highlight w:val="none"/>
+          <w:lang w:val="fr-FR" w:bidi="fr-FR"/>
+        </w:rPr>
+        <w:t xml:space="preserve">Faire la page mot de passe oublié avec envoi de mail.</w:t>
       </w:r>
       <w:r>
         <w:rPr>
@@ -1061,10 +1065,25 @@
         <w:rPr>
           <w:b/>
           <w:bCs/>
+          <w:lang w:val="fr-FR"/>
+        </w:rPr>
+        <w:t xml:space="preserve">Ajouter la possibilité de supprimer ou modifier un commentaire déjà fait</w:t>
+      </w:r>
+      <w:r>
+        <w:rPr>
+          <w:b/>
+          <w:bCs/>
           <w:highlight w:val="none"/>
-          <w:lang w:val="fr-FR" w:bidi="fr-FR"/>
+          <w:lang w:val="fr-FR"/>
         </w:rPr>
-        <w:t xml:space="preserve">Faire la page mot de passe oublié avec envoi de mail.</w:t>
+      </w:r>
+      <w:r>
+        <w:rPr>
+          <w:b/>
+          <w:bCs/>
+          <w:highlight w:val="none"/>
+          <w:lang w:val="fr-FR"/>
+        </w:rPr>
       </w:r>
       <w:r>
         <w:rPr>
@@ -1072,6 +1091,22 @@
           <w:bCs/>
           <w:highlight w:val="none"/>
           <w:lang w:val="fr-FR" w:bidi="fr-FR"/>
+        </w:rPr>
+      </w:r>
+      <w:r>
+        <w:rPr>
+          <w:b/>
+          <w:bCs/>
+          <w:highlight w:val="none"/>
+          <w:lang w:val="fr-FR" w:bidi="fr-FR"/>
+        </w:rPr>
+      </w:r>
+      <w:r>
+        <w:rPr>
+          <w:b/>
+          <w:bCs/>
+          <w:highlight w:val="none"/>
+          <w:lang w:val="fr-FR"/>
         </w:rPr>
       </w:r>
       <w:r>
@@ -1273,9 +1308,6 @@
       </w:r>
       <w:r>
         <w:rPr>
-          <w:b/>
-          <w:bCs/>
-          <w:highlight w:val="none"/>
           <w:lang w:val="fr-FR"/>
         </w:rPr>
       </w:r>
@@ -34120,7 +34152,7 @@
 </file>
 
 <file path=customXml/itemProps1.xml><?xml version="1.0" encoding="utf-8"?>
-<ds:datastoreItem xmlns:ds="http://schemas.openxmlformats.org/officeDocument/2006/customXml" ds:itemID="9c146052-9bab-4895-a1e6-627caf7154c4">
+<ds:datastoreItem xmlns:ds="http://schemas.openxmlformats.org/officeDocument/2006/customXml" ds:itemID="9C146052-9BAB-4895-A1E6-627CAF7154C4">
   <ds:schemaRefs>
     <ds:schemaRef ds:uri="http://schemas.openxmlformats.org/officeDocument/2006/bibliography"/>
   </ds:schemaRefs>

</xml_diff>